<commit_message>
amelioration de partie du compte et et demandes
</commit_message>
<xml_diff>
--- a/backend/src/main/resources/templates/demande_template1.docx
+++ b/backend/src/main/resources/templates/demande_template1.docx
@@ -181,16 +181,6 @@
                 <w:vertAlign w:val="baseline"/>
               </w:rPr>
             </w:pPr>
-            <w:r>
-              <w:rPr>
-                <w:rStyle w:val="5"/>
-                <w:sz w:val="28"/>
-                <w:szCs w:val="28"/>
-                <w:rtl/>
-                <w:lang w:bidi="ar-MA"/>
-              </w:rPr>
-              <w:t>بإقليم الصويرة</w:t>
-            </w:r>
           </w:p>
         </w:tc>
       </w:tr>
@@ -457,6 +447,13 @@
               <w:widowControl w:val="0"/>
               <w:bidi/>
               <w:jc w:val="both"/>
+              <w:rPr>
+                <w:rStyle w:val="5"/>
+                <w:sz w:val="36"/>
+                <w:szCs w:val="36"/>
+                <w:rtl/>
+                <w:lang w:bidi="ar-MA"/>
+              </w:rPr>
             </w:pPr>
             <w:r>
               <w:rPr>
@@ -489,7 +486,6 @@
               </w:rPr>
               <w:t xml:space="preserve"> </w:t>
             </w:r>
-            <w:bookmarkStart w:id="0" w:name="_GoBack"/>
             <w:r>
               <w:rPr>
                 <w:rStyle w:val="5"/>
@@ -499,18 +495,7 @@
                 <w:rtl/>
                 <w:lang w:val="fr-FR" w:bidi="ar-MA"/>
               </w:rPr>
-              <w:t>لجمعية</w:t>
-            </w:r>
-            <w:bookmarkEnd w:id="0"/>
-            <w:r>
-              <w:rPr>
-                <w:rStyle w:val="5"/>
-                <w:sz w:val="36"/>
-                <w:szCs w:val="36"/>
-                <w:rtl/>
-                <w:lang w:bidi="ar-MA"/>
-              </w:rPr>
-              <w:t xml:space="preserve"> </w:t>
+              <w:t>ل</w:t>
             </w:r>
             <w:r>
               <w:rPr>
@@ -531,7 +516,7 @@
                 <w:rtl/>
                 <w:lang w:bidi="ar-MA"/>
               </w:rPr>
-              <w:t xml:space="preserve"> بإقليم الصويرة.</w:t>
+              <w:t>.</w:t>
             </w:r>
           </w:p>
           <w:p>
@@ -539,6 +524,13 @@
               <w:widowControl w:val="0"/>
               <w:bidi/>
               <w:jc w:val="both"/>
+              <w:rPr>
+                <w:rStyle w:val="5"/>
+                <w:sz w:val="36"/>
+                <w:szCs w:val="36"/>
+                <w:rtl/>
+                <w:lang w:bidi="ar-MA"/>
+              </w:rPr>
             </w:pPr>
           </w:p>
           <w:p>
@@ -547,6 +539,10 @@
               <w:bidi/>
               <w:spacing w:before="120" w:after="240" w:line="360" w:lineRule="auto"/>
               <w:jc w:val="both"/>
+              <w:rPr>
+                <w:rFonts w:hint="default"/>
+                <w:lang w:val="en-US"/>
+              </w:rPr>
             </w:pPr>
             <w:r>
               <w:rPr>
@@ -599,6 +595,17 @@
                 <w:lang w:bidi="ar-MA"/>
               </w:rPr>
               <w:t xml:space="preserve"> </w:t>
+            </w:r>
+            <w:r>
+              <w:rPr>
+                <w:rStyle w:val="5"/>
+                <w:rFonts w:hint="default"/>
+                <w:sz w:val="36"/>
+                <w:szCs w:val="36"/>
+                <w:rtl w:val="0"/>
+                <w:lang w:val="en-US" w:bidi="ar-MA"/>
+              </w:rPr>
+              <w:t>.</w:t>
             </w:r>
           </w:p>
           <w:p>
@@ -692,36 +699,7 @@
               <w:widowControl w:val="0"/>
               <w:bidi/>
               <w:spacing w:before="120" w:after="240"/>
-              <w:ind w:firstLine="714"/>
               <w:jc w:val="center"/>
-            </w:pPr>
-            <w:r>
-              <w:rPr>
-                <w:rStyle w:val="5"/>
-                <w:b/>
-                <w:bCs/>
-                <w:sz w:val="36"/>
-                <w:szCs w:val="36"/>
-                <w:rtl/>
-                <w:lang w:bidi="ar-MA"/>
-              </w:rPr>
-              <w:t>الإمضاء</w:t>
-            </w:r>
-          </w:p>
-          <w:p>
-            <w:pPr>
-              <w:widowControl w:val="0"/>
-              <w:ind w:firstLine="3614" w:firstLineChars="1000"/>
-              <w:jc w:val="both"/>
-              <w:rPr>
-                <w:b/>
-                <w:bCs/>
-                <w:sz w:val="36"/>
-                <w:szCs w:val="36"/>
-                <w:vertAlign w:val="baseline"/>
-              </w:rPr>
-            </w:pPr>
-            <w:r>
               <w:rPr>
                 <w:rStyle w:val="5"/>
                 <w:rFonts w:hint="default"/>
@@ -732,8 +710,175 @@
                 <w:rtl w:val="0"/>
                 <w:lang w:val="en-US" w:bidi="ar-MA"/>
               </w:rPr>
-              <w:t>${TR3}</w:t>
-            </w:r>
+            </w:pPr>
+            <w:r>
+              <w:rPr>
+                <w:rStyle w:val="5"/>
+                <w:b/>
+                <w:bCs/>
+                <w:sz w:val="36"/>
+                <w:szCs w:val="36"/>
+                <w:rtl/>
+                <w:lang w:bidi="ar-MA"/>
+              </w:rPr>
+              <w:t>الإمضاء</w:t>
+            </w:r>
+          </w:p>
+          <w:tbl>
+            <w:tblPr>
+              <w:tblStyle w:val="4"/>
+              <w:bidiVisual/>
+              <w:tblW w:w="0" w:type="auto"/>
+              <w:tblInd w:w="5" w:type="dxa"/>
+              <w:tblBorders>
+                <w:top w:val="none" w:color="auto" w:sz="0" w:space="0"/>
+                <w:left w:val="none" w:color="auto" w:sz="0" w:space="0"/>
+                <w:bottom w:val="none" w:color="auto" w:sz="0" w:space="0"/>
+                <w:right w:val="none" w:color="auto" w:sz="0" w:space="0"/>
+                <w:insideH w:val="none" w:color="auto" w:sz="0" w:space="0"/>
+                <w:insideV w:val="none" w:color="auto" w:sz="0" w:space="0"/>
+              </w:tblBorders>
+              <w:tblLayout w:type="autofit"/>
+              <w:tblCellMar>
+                <w:top w:w="0" w:type="dxa"/>
+                <w:left w:w="108" w:type="dxa"/>
+                <w:bottom w:w="0" w:type="dxa"/>
+                <w:right w:w="108" w:type="dxa"/>
+              </w:tblCellMar>
+            </w:tblPr>
+            <w:tblGrid>
+              <w:gridCol w:w="3672"/>
+              <w:gridCol w:w="2621"/>
+              <w:gridCol w:w="3146"/>
+            </w:tblGrid>
+            <w:tr>
+              <w:tblPrEx>
+                <w:tblBorders>
+                  <w:top w:val="none" w:color="auto" w:sz="0" w:space="0"/>
+                  <w:left w:val="none" w:color="auto" w:sz="0" w:space="0"/>
+                  <w:bottom w:val="none" w:color="auto" w:sz="0" w:space="0"/>
+                  <w:right w:val="none" w:color="auto" w:sz="0" w:space="0"/>
+                  <w:insideH w:val="none" w:color="auto" w:sz="0" w:space="0"/>
+                  <w:insideV w:val="none" w:color="auto" w:sz="0" w:space="0"/>
+                </w:tblBorders>
+                <w:tblCellMar>
+                  <w:top w:w="0" w:type="dxa"/>
+                  <w:left w:w="108" w:type="dxa"/>
+                  <w:bottom w:w="0" w:type="dxa"/>
+                  <w:right w:w="108" w:type="dxa"/>
+                </w:tblCellMar>
+              </w:tblPrEx>
+              <w:tc>
+                <w:tcPr>
+                  <w:tcW w:w="3672" w:type="dxa"/>
+                  <w:tcBorders>
+                    <w:tl2br w:val="nil"/>
+                    <w:tr2bl w:val="nil"/>
+                  </w:tcBorders>
+                </w:tcPr>
+                <w:p>
+                  <w:pPr>
+                    <w:widowControl w:val="0"/>
+                    <w:bidi/>
+                    <w:spacing w:before="120" w:after="240"/>
+                    <w:jc w:val="center"/>
+                    <w:rPr>
+                      <w:rStyle w:val="5"/>
+                      <w:rFonts w:hint="default"/>
+                      <w:b/>
+                      <w:bCs/>
+                      <w:sz w:val="36"/>
+                      <w:szCs w:val="36"/>
+                      <w:vertAlign w:val="baseline"/>
+                      <w:rtl w:val="0"/>
+                      <w:lang w:val="en-US" w:bidi="ar-MA"/>
+                    </w:rPr>
+                  </w:pPr>
+                </w:p>
+              </w:tc>
+              <w:tc>
+                <w:tcPr>
+                  <w:tcW w:w="2621" w:type="dxa"/>
+                  <w:tcBorders>
+                    <w:tl2br w:val="nil"/>
+                    <w:tr2bl w:val="nil"/>
+                  </w:tcBorders>
+                </w:tcPr>
+                <w:p>
+                  <w:pPr>
+                    <w:widowControl w:val="0"/>
+                    <w:bidi/>
+                    <w:spacing w:before="120" w:after="240"/>
+                    <w:jc w:val="left"/>
+                    <w:rPr>
+                      <w:rStyle w:val="5"/>
+                      <w:rFonts w:hint="default"/>
+                      <w:b/>
+                      <w:bCs/>
+                      <w:sz w:val="36"/>
+                      <w:szCs w:val="36"/>
+                      <w:vertAlign w:val="baseline"/>
+                      <w:rtl w:val="0"/>
+                      <w:lang w:val="en-US" w:bidi="ar-MA"/>
+                    </w:rPr>
+                  </w:pPr>
+                  <w:r>
+                    <w:rPr>
+                      <w:rStyle w:val="5"/>
+                      <w:rFonts w:hint="default"/>
+                      <w:b/>
+                      <w:bCs/>
+                      <w:sz w:val="36"/>
+                      <w:szCs w:val="36"/>
+                      <w:rtl w:val="0"/>
+                      <w:lang w:val="en-US" w:bidi="ar-MA"/>
+                    </w:rPr>
+                    <w:t>${TR3}</w:t>
+                  </w:r>
+                </w:p>
+              </w:tc>
+              <w:tc>
+                <w:tcPr>
+                  <w:tcW w:w="3146" w:type="dxa"/>
+                  <w:tcBorders>
+                    <w:tl2br w:val="nil"/>
+                    <w:tr2bl w:val="nil"/>
+                  </w:tcBorders>
+                </w:tcPr>
+                <w:p>
+                  <w:pPr>
+                    <w:widowControl w:val="0"/>
+                    <w:bidi/>
+                    <w:spacing w:before="120" w:after="240"/>
+                    <w:jc w:val="center"/>
+                    <w:rPr>
+                      <w:rStyle w:val="5"/>
+                      <w:rFonts w:hint="default"/>
+                      <w:b/>
+                      <w:bCs/>
+                      <w:sz w:val="36"/>
+                      <w:szCs w:val="36"/>
+                      <w:vertAlign w:val="baseline"/>
+                      <w:rtl w:val="0"/>
+                      <w:lang w:val="en-US" w:bidi="ar-MA"/>
+                    </w:rPr>
+                  </w:pPr>
+                </w:p>
+              </w:tc>
+            </w:tr>
+          </w:tbl>
+          <w:p>
+            <w:pPr>
+              <w:widowControl w:val="0"/>
+              <w:jc w:val="center"/>
+              <w:rPr>
+                <w:b/>
+                <w:bCs/>
+                <w:sz w:val="36"/>
+                <w:szCs w:val="36"/>
+                <w:vertAlign w:val="baseline"/>
+              </w:rPr>
+            </w:pPr>
           </w:p>
         </w:tc>
       </w:tr>
@@ -801,12 +946,6 @@
                 <w:lang w:val="en-US" w:eastAsia="zh-CN" w:bidi="ar-SA"/>
               </w:rPr>
             </w:pPr>
-            <w:r>
-              <w:rPr>
-                <w:rtl/>
-              </w:rPr>
-              <w:t>التوقيع</w:t>
-            </w:r>
           </w:p>
         </w:tc>
         <w:tc>
@@ -854,12 +993,6 @@
                 <w:lang w:val="en-US" w:eastAsia="zh-CN" w:bidi="ar-SA"/>
               </w:rPr>
             </w:pPr>
-            <w:r>
-              <w:rPr>
-                <w:rtl/>
-              </w:rPr>
-              <w:t>التوقيع</w:t>
-            </w:r>
           </w:p>
         </w:tc>
         <w:tc>
@@ -901,12 +1034,6 @@
                 <w:lang w:val="en-US"/>
               </w:rPr>
             </w:pPr>
-            <w:r>
-              <w:rPr>
-                <w:rtl/>
-              </w:rPr>
-              <w:t>التوقيع</w:t>
-            </w:r>
           </w:p>
         </w:tc>
       </w:tr>
@@ -960,6 +1087,7 @@
           <w:lang w:val="en-US"/>
         </w:rPr>
       </w:pPr>
+      <w:bookmarkStart w:id="0" w:name="_GoBack"/>
       <w:r>
         <w:rPr>
           <w:rFonts w:hint="default"/>
@@ -968,6 +1096,7 @@
         <w:t xml:space="preserve">  </w:t>
       </w:r>
     </w:p>
+    <w:bookmarkEnd w:id="0"/>
     <w:sectPr>
       <w:pgSz w:w="11906" w:h="16838"/>
       <w:pgMar w:top="851" w:right="1267" w:bottom="1411" w:left="993" w:header="720" w:footer="720" w:gutter="0"/>
@@ -1161,7 +1290,7 @@
     <w:lsdException w:uiPriority="99" w:name="Table Web 2"/>
     <w:lsdException w:uiPriority="99" w:name="Table Web 3"/>
     <w:lsdException w:uiPriority="99" w:name="Balloon Text"/>
-    <w:lsdException w:unhideWhenUsed="0" w:uiPriority="39" w:semiHidden="0" w:name="Table Grid"/>
+    <w:lsdException w:qFormat="1" w:unhideWhenUsed="0" w:uiPriority="39" w:semiHidden="0" w:name="Table Grid"/>
     <w:lsdException w:uiPriority="99" w:name="Table Theme"/>
     <w:lsdException w:unhideWhenUsed="0" w:uiPriority="60" w:semiHidden="0" w:name="Light Shading"/>
     <w:lsdException w:unhideWhenUsed="0" w:uiPriority="61" w:semiHidden="0" w:name="Light List"/>
@@ -1305,6 +1434,7 @@
   <w:style w:type="table" w:styleId="4">
     <w:name w:val="Table Grid"/>
     <w:basedOn w:val="3"/>
+    <w:qFormat/>
     <w:uiPriority w:val="39"/>
     <w:pPr>
       <w:widowControl w:val="0"/>

</xml_diff>